<commit_message>
actualizar hasta semana 5
</commit_message>
<xml_diff>
--- a/ia-teoria/semana5/ia-definiciones/Que es la IA.docx
+++ b/ia-teoria/semana5/ia-definiciones/Que es la IA.docx
@@ -4,6 +4,7 @@
   <w:body>
     <w:p>
       <w:pPr>
+        <w:pStyle w:val="Ttulo1"/>
         <w:rPr>
           <w:lang w:val="es-MX"/>
         </w:rPr>
@@ -121,6 +122,7 @@
     </w:p>
     <w:p>
       <w:pPr>
+        <w:pStyle w:val="Ttulo2"/>
         <w:rPr>
           <w:lang w:val="es-MX"/>
         </w:rPr>
@@ -253,6 +255,7 @@
         <w:rPr>
           <w:lang w:val="es-MX"/>
         </w:rPr>
+        <w:lastRenderedPageBreak/>
         <w:t xml:space="preserve"> • </w:t>
       </w:r>
       <w:r>
@@ -277,7 +280,25 @@
           <w:bCs/>
           <w:lang w:val="es-MX"/>
         </w:rPr>
-        <w:t xml:space="preserve">Machine Learning) </w:t>
+        <w:t xml:space="preserve">Machine </w:t>
+      </w:r>
+      <w:proofErr w:type="spellStart"/>
+      <w:r>
+        <w:rPr>
+          <w:b/>
+          <w:bCs/>
+          <w:lang w:val="es-MX"/>
+        </w:rPr>
+        <w:t>Learning</w:t>
+      </w:r>
+      <w:proofErr w:type="spellEnd"/>
+      <w:r>
+        <w:rPr>
+          <w:b/>
+          <w:bCs/>
+          <w:lang w:val="es-MX"/>
+        </w:rPr>
+        <w:t xml:space="preserve">) </w:t>
       </w:r>
       <w:r>
         <w:rPr>
@@ -296,7 +317,6 @@
         <w:rPr>
           <w:lang w:val="es-MX"/>
         </w:rPr>
-        <w:lastRenderedPageBreak/>
         <w:t xml:space="preserve">Estos </w:t>
       </w:r>
       <w:r>
@@ -333,6 +353,7 @@
     </w:p>
     <w:p>
       <w:pPr>
+        <w:pStyle w:val="Ttulo2"/>
         <w:rPr>
           <w:lang w:val="es-MX"/>
         </w:rPr>
@@ -346,6 +367,7 @@
     </w:p>
     <w:p>
       <w:pPr>
+        <w:pStyle w:val="Ttulo3"/>
         <w:rPr>
           <w:lang w:val="es-MX"/>
         </w:rPr>
@@ -493,21 +515,16 @@
     </w:p>
     <w:p>
       <w:pPr>
-        <w:rPr>
-          <w:lang w:val="es-MX"/>
-        </w:rPr>
-      </w:pPr>
-      <w:r>
-        <w:rPr>
-          <w:lang w:val="es-MX"/>
-        </w:rPr>
-        <w:t>Adquisición</w:t>
-      </w:r>
-      <w:r>
-        <w:rPr>
-          <w:lang w:val="es-MX"/>
-        </w:rPr>
-        <w:t xml:space="preserve"> de conocimiento</w:t>
+        <w:pStyle w:val="Ttulo4"/>
+        <w:rPr>
+          <w:lang w:val="es-MX"/>
+        </w:rPr>
+      </w:pPr>
+      <w:r>
+        <w:rPr>
+          <w:lang w:val="es-MX"/>
+        </w:rPr>
+        <w:t>Adquisición de conocimiento</w:t>
       </w:r>
     </w:p>
     <w:p>
@@ -548,6 +565,9 @@
       </w:r>
     </w:p>
     <w:p>
+      <w:pPr>
+        <w:pStyle w:val="Ttulo4"/>
+      </w:pPr>
       <w:r>
         <w:rPr>
           <w:lang w:val="es-MX"/>
@@ -564,7 +584,21 @@
         <w:rPr>
           <w:lang w:val="es-MX"/>
         </w:rPr>
-        <w:t>Machine Learning)</w:t>
+        <w:t xml:space="preserve">Machine </w:t>
+      </w:r>
+      <w:proofErr w:type="spellStart"/>
+      <w:r>
+        <w:rPr>
+          <w:lang w:val="es-MX"/>
+        </w:rPr>
+        <w:t>Learning</w:t>
+      </w:r>
+      <w:proofErr w:type="spellEnd"/>
+      <w:r>
+        <w:rPr>
+          <w:lang w:val="es-MX"/>
+        </w:rPr>
+        <w:t>)</w:t>
       </w:r>
     </w:p>
     <w:p>
@@ -584,7 +618,21 @@
         <w:rPr>
           <w:lang w:val="es-MX"/>
         </w:rPr>
-        <w:t xml:space="preserve"> de conocimiento de la ia </w:t>
+        <w:t xml:space="preserve"> de conocimiento de la </w:t>
+      </w:r>
+      <w:proofErr w:type="spellStart"/>
+      <w:r>
+        <w:rPr>
+          <w:lang w:val="es-MX"/>
+        </w:rPr>
+        <w:t>ia</w:t>
+      </w:r>
+      <w:proofErr w:type="spellEnd"/>
+      <w:r>
+        <w:rPr>
+          <w:lang w:val="es-MX"/>
+        </w:rPr>
+        <w:t xml:space="preserve"> </w:t>
       </w:r>
       <w:r>
         <w:rPr>
@@ -608,14 +656,14 @@
         <w:rPr>
           <w:lang w:val="es-MX"/>
         </w:rPr>
-        <w:t xml:space="preserve"> como ejemplo el caso de meta-DENDRAL, citando al autor: “Ese conocimiento se obtuvo gracias a las entrevistas realizadas. Pero ¿cómo lo adquirieron? Observando miles de espectros. Por eso, buscábamos un programa </w:t>
+        <w:t xml:space="preserve"> como ejemplo el caso de meta-DENDRAL, citando al autor: </w:t>
       </w:r>
       <w:r>
         <w:rPr>
           <w:lang w:val="es-MX"/>
         </w:rPr>
         <w:lastRenderedPageBreak/>
-        <w:t xml:space="preserve">que analizara miles de espectros e </w:t>
+        <w:t xml:space="preserve">“Ese conocimiento se obtuvo gracias a las entrevistas realizadas. Pero ¿cómo lo adquirieron? Observando miles de espectros. Por eso, buscábamos un programa que analizara miles de espectros e </w:t>
       </w:r>
       <w:r>
         <w:rPr>
@@ -883,6 +931,7 @@
     </w:p>
     <w:p>
       <w:pPr>
+        <w:pStyle w:val="Ttulo2"/>
         <w:rPr>
           <w:lang w:val="es-MX"/>
         </w:rPr>
@@ -903,8 +952,16 @@
         <w:rPr>
           <w:lang w:val="es-MX"/>
         </w:rPr>
-        <w:t xml:space="preserve"> Moderno – Machine Learning</w:t>
-      </w:r>
+        <w:t xml:space="preserve"> Moderno – Machine </w:t>
+      </w:r>
+      <w:proofErr w:type="spellStart"/>
+      <w:r>
+        <w:rPr>
+          <w:lang w:val="es-MX"/>
+        </w:rPr>
+        <w:t>Learning</w:t>
+      </w:r>
+      <w:proofErr w:type="spellEnd"/>
     </w:p>
     <w:p>
       <w:pPr>
@@ -954,25 +1011,7 @@
         <w:rPr>
           <w:lang w:val="es-MX"/>
         </w:rPr>
-        <w:t xml:space="preserve">La experiencia E serian los datos de entrenamiento, mediante métodos </w:t>
-      </w:r>
-      <w:r>
-        <w:rPr>
-          <w:lang w:val="es-MX"/>
-        </w:rPr>
-        <w:t xml:space="preserve"> estadísticos </w:t>
-      </w:r>
-      <w:r>
-        <w:rPr>
-          <w:lang w:val="es-MX"/>
-        </w:rPr>
-        <w:t>se</w:t>
-      </w:r>
-      <w:r>
-        <w:rPr>
-          <w:lang w:val="es-MX"/>
-        </w:rPr>
-        <w:t xml:space="preserve"> aprender de los datos y generalizarlos a datos no vistos, y así realizar tareas sin instrucciones explícitas en </w:t>
+        <w:t xml:space="preserve">La experiencia E serian los datos de entrenamiento, mediante métodos  estadísticos se aprender de los datos y generalizarlos a datos no vistos, y así realizar tareas sin instrucciones explícitas en </w:t>
       </w:r>
       <w:r>
         <w:rPr>
@@ -1027,22 +1066,23 @@
     </w:p>
     <w:p>
       <w:pPr>
-        <w:rPr>
-          <w:lang w:val="es-MX"/>
-        </w:rPr>
-      </w:pPr>
-    </w:p>
-    <w:p>
-      <w:pPr>
-        <w:rPr>
-          <w:lang w:val="es-MX"/>
-        </w:rPr>
-      </w:pPr>
-      <w:r>
-        <w:rPr>
-          <w:lang w:val="es-MX"/>
-        </w:rPr>
-        <w:lastRenderedPageBreak/>
+        <w:pStyle w:val="Ttulo4"/>
+        <w:rPr>
+          <w:lang w:val="es-MX"/>
+        </w:rPr>
+      </w:pPr>
+    </w:p>
+    <w:p>
+      <w:pPr>
+        <w:pStyle w:val="Ttulo4"/>
+        <w:rPr>
+          <w:lang w:val="es-MX"/>
+        </w:rPr>
+      </w:pPr>
+      <w:r>
+        <w:rPr>
+          <w:lang w:val="es-MX"/>
+        </w:rPr>
         <w:t>Ejemplos de Aplicación de ML</w:t>
       </w:r>
     </w:p>
@@ -1063,13 +1103,7 @@
     </w:p>
     <w:p>
       <w:r>
-        <w:t xml:space="preserve">Pronóstico de los ingresos de </w:t>
-      </w:r>
-      <w:r>
-        <w:t>una</w:t>
-      </w:r>
-      <w:r>
-        <w:t xml:space="preserve"> empresa para el próximo año, basado en diversas métricas de rendimiento.</w:t>
+        <w:t>Pronóstico de los ingresos de una empresa para el próximo año, basado en diversas métricas de rendimiento.</w:t>
       </w:r>
     </w:p>
     <w:p>
@@ -1084,41 +1118,106 @@
     </w:p>
     <w:p>
       <w:pPr>
-        <w:rPr>
-          <w:lang w:val="es-MX"/>
-        </w:rPr>
-      </w:pPr>
-      <w:r>
-        <w:rPr>
-          <w:lang w:val="es-MX"/>
-        </w:rPr>
-        <w:t>Tipos de Aprendizaje Automatico</w:t>
-      </w:r>
-    </w:p>
-    <w:p>
-      <w:pPr>
-        <w:rPr>
-          <w:lang w:val="es-MX"/>
-        </w:rPr>
-      </w:pPr>
-      <w:r>
-        <w:rPr>
-          <w:lang w:val="es-MX"/>
-        </w:rPr>
-        <w:t>Existen tres grandes criterios de clasificación de tipos de paredizaje automatico:</w:t>
-      </w:r>
-    </w:p>
-    <w:p>
-      <w:pPr>
-        <w:rPr>
-          <w:lang w:val="es-MX"/>
-        </w:rPr>
-      </w:pPr>
-      <w:r>
-        <w:rPr>
-          <w:lang w:val="es-MX"/>
-        </w:rPr>
-        <w:t>Según el tipo de supervisacion durante el entrenamiento, pueden ser: supervisado, no supervisado, semi-supervisaco y otros.</w:t>
+        <w:pStyle w:val="Ttulo2"/>
+        <w:rPr>
+          <w:lang w:val="es-MX"/>
+        </w:rPr>
+      </w:pPr>
+      <w:r>
+        <w:rPr>
+          <w:lang w:val="es-MX"/>
+        </w:rPr>
+        <w:t xml:space="preserve">Tipos de Aprendizaje </w:t>
+      </w:r>
+      <w:proofErr w:type="spellStart"/>
+      <w:r>
+        <w:rPr>
+          <w:lang w:val="es-MX"/>
+        </w:rPr>
+        <w:t>Automatico</w:t>
+      </w:r>
+      <w:proofErr w:type="spellEnd"/>
+    </w:p>
+    <w:p>
+      <w:pPr>
+        <w:rPr>
+          <w:lang w:val="es-MX"/>
+        </w:rPr>
+      </w:pPr>
+      <w:r>
+        <w:rPr>
+          <w:lang w:val="es-MX"/>
+        </w:rPr>
+        <w:t xml:space="preserve">Existen tres grandes criterios de clasificación de tipos de </w:t>
+      </w:r>
+      <w:proofErr w:type="spellStart"/>
+      <w:r>
+        <w:rPr>
+          <w:lang w:val="es-MX"/>
+        </w:rPr>
+        <w:t>paredizaje</w:t>
+      </w:r>
+      <w:proofErr w:type="spellEnd"/>
+      <w:r>
+        <w:rPr>
+          <w:lang w:val="es-MX"/>
+        </w:rPr>
+        <w:t xml:space="preserve"> </w:t>
+      </w:r>
+      <w:proofErr w:type="spellStart"/>
+      <w:r>
+        <w:rPr>
+          <w:lang w:val="es-MX"/>
+        </w:rPr>
+        <w:t>automatico</w:t>
+      </w:r>
+      <w:proofErr w:type="spellEnd"/>
+      <w:r>
+        <w:rPr>
+          <w:lang w:val="es-MX"/>
+        </w:rPr>
+        <w:t>:</w:t>
+      </w:r>
+    </w:p>
+    <w:p>
+      <w:pPr>
+        <w:rPr>
+          <w:lang w:val="es-MX"/>
+        </w:rPr>
+      </w:pPr>
+      <w:r>
+        <w:rPr>
+          <w:lang w:val="es-MX"/>
+        </w:rPr>
+        <w:t xml:space="preserve">Según el tipo de </w:t>
+      </w:r>
+      <w:proofErr w:type="spellStart"/>
+      <w:r>
+        <w:rPr>
+          <w:lang w:val="es-MX"/>
+        </w:rPr>
+        <w:t>supervisacion</w:t>
+      </w:r>
+      <w:proofErr w:type="spellEnd"/>
+      <w:r>
+        <w:rPr>
+          <w:lang w:val="es-MX"/>
+        </w:rPr>
+        <w:t xml:space="preserve"> durante el entrenamiento, pueden ser: supervisado, no supervisado, </w:t>
+      </w:r>
+      <w:proofErr w:type="spellStart"/>
+      <w:r>
+        <w:rPr>
+          <w:lang w:val="es-MX"/>
+        </w:rPr>
+        <w:t>semi-supervisaco</w:t>
+      </w:r>
+      <w:proofErr w:type="spellEnd"/>
+      <w:r>
+        <w:rPr>
+          <w:lang w:val="es-MX"/>
+        </w:rPr>
+        <w:t xml:space="preserve"> y otros.</w:t>
       </w:r>
     </w:p>
     <w:p>
@@ -1175,6 +1274,7 @@
     </w:p>
     <w:p>
       <w:pPr>
+        <w:pStyle w:val="Ttulo3"/>
         <w:rPr>
           <w:lang w:val="es-MX"/>
         </w:rPr>
@@ -1245,7 +1345,11 @@
         <w:t>predecir un valor numérico</w:t>
       </w:r>
       <w:r>
-        <w:t xml:space="preserve"> objetivo, como el precio de un automóvil, dado un conjunto de características (kilometraje, edad, marca, etc.). Este tipo de tarea se llama </w:t>
+        <w:t xml:space="preserve"> objetivo, como el precio de un automóvil, dado un conjunto de características (kilometraje, edad, marca, etc.). </w:t>
+      </w:r>
+      <w:r>
+        <w:lastRenderedPageBreak/>
+        <w:t xml:space="preserve">Este tipo de tarea se llama </w:t>
       </w:r>
       <w:r>
         <w:rPr>
@@ -1255,36 +1359,21 @@
         <w:t>regresión</w:t>
       </w:r>
       <w:r>
-        <w:t xml:space="preserve">. Para entrenar el sistema, necesitas darle </w:t>
-      </w:r>
-      <w:r>
-        <w:lastRenderedPageBreak/>
-        <w:t>muchos ejemplos de automóviles, incluyendo tanto sus características como sus objetivos (es decir, sus precios).</w:t>
-      </w:r>
-    </w:p>
-    <w:p>
-      <w:pPr>
-        <w:rPr>
-          <w:lang w:val="es-MX"/>
-        </w:rPr>
-      </w:pPr>
-      <w:r>
-        <w:rPr>
-          <w:lang w:val="es-MX"/>
-        </w:rPr>
-        <w:t xml:space="preserve">Aprendizaje </w:t>
-      </w:r>
-      <w:r>
-        <w:rPr>
-          <w:lang w:val="es-MX"/>
-        </w:rPr>
-        <w:t xml:space="preserve">No </w:t>
-      </w:r>
-      <w:r>
-        <w:rPr>
-          <w:lang w:val="es-MX"/>
-        </w:rPr>
-        <w:t>Supervisado</w:t>
+        <w:t>. Para entrenar el sistema, necesitas darle muchos ejemplos de automóviles, incluyendo tanto sus características como sus objetivos (es decir, sus precios).</w:t>
+      </w:r>
+    </w:p>
+    <w:p>
+      <w:pPr>
+        <w:pStyle w:val="Ttulo3"/>
+        <w:rPr>
+          <w:lang w:val="es-MX"/>
+        </w:rPr>
+      </w:pPr>
+      <w:r>
+        <w:rPr>
+          <w:lang w:val="es-MX"/>
+        </w:rPr>
+        <w:t>Aprendizaje No Supervisado</w:t>
       </w:r>
     </w:p>
     <w:p>
@@ -1307,23 +1396,26 @@
           <w:b/>
           <w:bCs/>
         </w:rPr>
-        <w:t>algoritmo de agrupamiento</w:t>
-      </w:r>
+        <w:t>algoritmo de agrupamiento(</w:t>
+      </w:r>
+      <w:proofErr w:type="spellStart"/>
       <w:r>
         <w:rPr>
           <w:b/>
           <w:bCs/>
         </w:rPr>
-        <w:t>(clustering)</w:t>
-      </w:r>
-      <w:r>
-        <w:t xml:space="preserve"> para intentar detectar grupos de visitantes </w:t>
-      </w:r>
-      <w:r>
-        <w:t>similares.</w:t>
-      </w:r>
-      <w:r>
-        <w:t xml:space="preserve"> En ningún momento le dices al algoritmo a qué grupo pertenece un visitante: él encuentra esas conexiones sin tu ayuda. Por ejemplo, podría darse cuenta de que el 40% de tus visitantes son adolescentes que aman los cómics y generalmente leen tu blog después de la escuela, mientras que el 20% son adultos que disfrutan de la ciencia ficción y que visitan durante los fines de semana.</w:t>
+        <w:t>clustering</w:t>
+      </w:r>
+      <w:proofErr w:type="spellEnd"/>
+      <w:r>
+        <w:rPr>
+          <w:b/>
+          <w:bCs/>
+        </w:rPr>
+        <w:t>)</w:t>
+      </w:r>
+      <w:r>
+        <w:t xml:space="preserve"> para intentar detectar grupos de visitantes similares. En ningún momento le dices al algoritmo a qué grupo pertenece un visitante: él encuentra esas conexiones sin tu ayuda. Por ejemplo, podría darse cuenta de que el 40% de tus visitantes son adolescentes que aman los cómics y generalmente leen tu blog después de la escuela, mientras que el 20% son adultos que disfrutan de la ciencia ficción y que visitan durante los fines de semana.</w:t>
       </w:r>
     </w:p>
     <w:p>
@@ -1337,7 +1429,15 @@
         <w:t>tarea no supervisada es la detección de anomalías.</w:t>
       </w:r>
       <w:r>
-        <w:t xml:space="preserve"> En ejemplor es al detectar defectos de fabricación, </w:t>
+        <w:t xml:space="preserve"> En </w:t>
+      </w:r>
+      <w:proofErr w:type="spellStart"/>
+      <w:r>
+        <w:t>ejemplor</w:t>
+      </w:r>
+      <w:proofErr w:type="spellEnd"/>
+      <w:r>
+        <w:t xml:space="preserve"> es al detectar defectos de fabricación, </w:t>
       </w:r>
       <w:r>
         <w:t xml:space="preserve">detectar defectos de fabricación, o eliminar automáticamente valores atípicos de un conjunto de datos antes de alimentarlos a otro algoritmo de aprendizaje. El sistema se muestra en su mayoría </w:t>
@@ -1350,6 +1450,9 @@
       </w:r>
     </w:p>
     <w:p>
+      <w:pPr>
+        <w:pStyle w:val="Ttulo3"/>
+      </w:pPr>
       <w:r>
         <w:t xml:space="preserve">Aprendizaje por Refuerzo </w:t>
       </w:r>
@@ -1370,16 +1473,19 @@
         <w:t xml:space="preserve">tipo el </w:t>
       </w:r>
       <w:r>
-        <w:t xml:space="preserve">sistema de aprendizaje, llamado agente </w:t>
-      </w:r>
-      <w:r>
-        <w:t>inteligente en</w:t>
-      </w:r>
-      <w:r>
-        <w:t xml:space="preserve"> este </w:t>
-      </w:r>
-      <w:r>
-        <w:t>contexto</w:t>
+        <w:t>sistema de aprendizaje</w:t>
+      </w:r>
+      <w:r>
+        <w:t>(</w:t>
+      </w:r>
+      <w:r>
+        <w:t xml:space="preserve">llamado agente </w:t>
+      </w:r>
+      <w:r>
+        <w:t>inteligente</w:t>
+      </w:r>
+      <w:r>
+        <w:t xml:space="preserve"> o modelo)</w:t>
       </w:r>
       <w:r>
         <w:t xml:space="preserve"> puede observar el entorno, seleccionar y realizar acciones, y obtener recompensas a cambio (o penalizaciones en forma de recompensas negativas). Luego debe aprender por sí mismo cuál es la mejor estrategia, llamada política, para obtener la mayor recompensa a lo largo del tiempo. Una política define qué acción debe elegir el agente cuando se encuentra en una situación dada.</w:t>
@@ -1394,78 +1500,213 @@
     </w:p>
     <w:p>
       <w:pPr>
-        <w:rPr>
-          <w:lang w:val="es-MX"/>
-        </w:rPr>
-      </w:pPr>
-    </w:p>
-    <w:p>
-      <w:pPr>
-        <w:rPr>
-          <w:lang w:val="es-MX"/>
-        </w:rPr>
-      </w:pPr>
-    </w:p>
-    <w:p>
-      <w:pPr>
-        <w:rPr>
-          <w:lang w:val="es-MX"/>
-        </w:rPr>
-      </w:pPr>
-    </w:p>
-    <w:p>
-      <w:pPr>
-        <w:rPr>
-          <w:lang w:val="es-MX"/>
-        </w:rPr>
-      </w:pPr>
-    </w:p>
-    <w:p>
-      <w:pPr>
-        <w:rPr>
-          <w:lang w:val="es-MX"/>
-        </w:rPr>
-      </w:pPr>
-    </w:p>
-    <w:p>
-      <w:pPr>
-        <w:rPr>
-          <w:lang w:val="es-MX"/>
-        </w:rPr>
-      </w:pPr>
-    </w:p>
-    <w:p>
-      <w:pPr>
-        <w:rPr>
-          <w:lang w:val="es-MX"/>
-        </w:rPr>
-      </w:pPr>
-    </w:p>
-    <w:p>
-      <w:pPr>
-        <w:rPr>
-          <w:lang w:val="es-MX"/>
-        </w:rPr>
-      </w:pPr>
-    </w:p>
-    <w:p>
-      <w:pPr>
-        <w:rPr>
-          <w:lang w:val="es-MX"/>
-        </w:rPr>
-      </w:pPr>
-    </w:p>
-    <w:p>
-      <w:pPr>
-        <w:rPr>
-          <w:lang w:val="es-MX"/>
-        </w:rPr>
-      </w:pPr>
-      <w:hyperlink r:id="rId7">
+        <w:pStyle w:val="Ttulo3"/>
+        <w:rPr>
+          <w:lang w:val="es-MX"/>
+        </w:rPr>
+      </w:pPr>
+      <w:r>
+        <w:rPr>
+          <w:lang w:val="es-MX"/>
+        </w:rPr>
+        <w:t>Aprendizaje Profundo</w:t>
+      </w:r>
+    </w:p>
+    <w:p>
+      <w:pPr>
+        <w:rPr>
+          <w:b/>
+          <w:bCs/>
+          <w:lang w:val="es-MX"/>
+        </w:rPr>
+      </w:pPr>
+      <w:r>
+        <w:rPr>
+          <w:lang w:val="es-MX"/>
+        </w:rPr>
+        <w:t xml:space="preserve">Es el tipo de Aprendizaje automático en el que se usa arquitectura de redes neuronales como implementación. Para ser llamado profundo debe tener </w:t>
+      </w:r>
+      <w:r>
+        <w:rPr>
+          <w:b/>
+          <w:bCs/>
+          <w:lang w:val="es-MX"/>
+        </w:rPr>
+        <w:t>m</w:t>
+      </w:r>
+      <w:r>
+        <w:rPr>
+          <w:b/>
+          <w:bCs/>
+          <w:lang w:val="es-MX"/>
+        </w:rPr>
+        <w:t>á</w:t>
+      </w:r>
+      <w:r>
+        <w:rPr>
+          <w:b/>
+          <w:bCs/>
+          <w:lang w:val="es-MX"/>
+        </w:rPr>
+        <w:t>s de 2 capas ocultas</w:t>
+      </w:r>
+      <w:r>
+        <w:rPr>
+          <w:lang w:val="es-MX"/>
+        </w:rPr>
+        <w:t xml:space="preserve">, entre las de entrada y salida. Siendo la de solo una capa el clásico </w:t>
+      </w:r>
+      <w:r>
+        <w:rPr>
+          <w:b/>
+          <w:bCs/>
+          <w:lang w:val="es-MX"/>
+        </w:rPr>
+        <w:t>Perceptrón</w:t>
+      </w:r>
+    </w:p>
+    <w:p>
+      <w:pPr>
+        <w:rPr>
+          <w:lang w:val="es-MX"/>
+        </w:rPr>
+      </w:pPr>
+    </w:p>
+    <w:p>
+      <w:pPr>
+        <w:rPr>
+          <w:lang w:val="es-MX"/>
+        </w:rPr>
+      </w:pPr>
+    </w:p>
+    <w:p>
+      <w:pPr>
+        <w:pStyle w:val="Ttulo2"/>
+        <w:rPr>
+          <w:lang w:val="es-MX"/>
+        </w:rPr>
+      </w:pPr>
+      <w:r>
+        <w:rPr>
+          <w:lang w:val="es-MX"/>
+        </w:rPr>
+        <w:lastRenderedPageBreak/>
+        <w:t>Referencias bibliográficas</w:t>
+      </w:r>
+    </w:p>
+    <w:p>
+      <w:pPr>
+        <w:rPr>
+          <w:b/>
+          <w:bCs/>
+          <w:lang w:val="en-US"/>
+        </w:rPr>
+      </w:pPr>
+      <w:hyperlink r:id="rId7" w:history="1">
         <w:r>
           <w:rPr>
             <w:rStyle w:val="Hipervnculo"/>
-            <w:lang w:val="es-MX"/>
+            <w:b/>
+            <w:bCs/>
+            <w:lang w:val="en-US"/>
+          </w:rPr>
+          <w:t xml:space="preserve">Aurélien </w:t>
+        </w:r>
+        <w:proofErr w:type="spellStart"/>
+        <w:r>
+          <w:rPr>
+            <w:rStyle w:val="Hipervnculo"/>
+            <w:b/>
+            <w:bCs/>
+            <w:lang w:val="en-US"/>
+          </w:rPr>
+          <w:t>Géron</w:t>
+        </w:r>
+        <w:proofErr w:type="spellEnd"/>
+      </w:hyperlink>
+      <w:r>
+        <w:rPr>
+          <w:b/>
+          <w:bCs/>
+          <w:lang w:val="en-US"/>
+        </w:rPr>
+        <w:t xml:space="preserve">, </w:t>
+      </w:r>
+      <w:r>
+        <w:rPr>
+          <w:lang w:val="en-US"/>
+        </w:rPr>
+        <w:t>H</w:t>
+      </w:r>
+      <w:r>
+        <w:rPr>
+          <w:lang w:val="en-US"/>
+        </w:rPr>
+        <w:t xml:space="preserve">ands-On Machine Learning with Scikit-Learn, </w:t>
+      </w:r>
+      <w:proofErr w:type="spellStart"/>
+      <w:r>
+        <w:rPr>
+          <w:lang w:val="en-US"/>
+        </w:rPr>
+        <w:t>Keras</w:t>
+      </w:r>
+      <w:proofErr w:type="spellEnd"/>
+      <w:r>
+        <w:rPr>
+          <w:lang w:val="en-US"/>
+        </w:rPr>
+        <w:t>, and TensorFlow</w:t>
+      </w:r>
+    </w:p>
+    <w:p>
+      <w:r>
+        <w:rPr>
+          <w:b/>
+          <w:bCs/>
+        </w:rPr>
+        <w:t xml:space="preserve">Russell y Peter </w:t>
+      </w:r>
+      <w:proofErr w:type="spellStart"/>
+      <w:r>
+        <w:rPr>
+          <w:b/>
+          <w:bCs/>
+        </w:rPr>
+        <w:t>Norvig</w:t>
+      </w:r>
+      <w:proofErr w:type="spellEnd"/>
+      <w:r>
+        <w:rPr>
+          <w:b/>
+          <w:bCs/>
+        </w:rPr>
+        <w:t xml:space="preserve">, </w:t>
+      </w:r>
+      <w:r>
+        <w:t>INTELIGENCIA ARTIFICIAL</w:t>
+      </w:r>
+      <w:r>
+        <w:t xml:space="preserve">_ </w:t>
+      </w:r>
+      <w:r>
+        <w:t xml:space="preserve">Un </w:t>
+      </w:r>
+      <w:r>
+        <w:t>Enfoque Moderno</w:t>
+      </w:r>
+    </w:p>
+    <w:p>
+      <w:pPr>
+        <w:rPr>
+          <w:lang w:val="en-US"/>
+        </w:rPr>
+      </w:pPr>
+      <w:hyperlink r:id="rId8">
+        <w:r>
+          <w:rPr>
+            <w:rStyle w:val="Hipervnculo"/>
+            <w:lang w:val="en-US"/>
           </w:rPr>
           <w:t>https://machine-learning-made-simple.medium.com/picking-between-gofai-ml-and-deep-learning-summary-217c5471358b</w:t>
         </w:r>
@@ -1474,21 +1715,14 @@
     <w:p>
       <w:pPr>
         <w:rPr>
-          <w:lang w:val="es-MX"/>
-        </w:rPr>
-      </w:pPr>
-    </w:p>
-    <w:p>
-      <w:pPr>
-        <w:rPr>
-          <w:lang w:val="es-MX"/>
-        </w:rPr>
-      </w:pPr>
-      <w:hyperlink r:id="rId8">
+          <w:lang w:val="en-US"/>
+        </w:rPr>
+      </w:pPr>
+      <w:hyperlink r:id="rId9">
         <w:r>
           <w:rPr>
             <w:rStyle w:val="Hipervnculo"/>
-            <w:lang w:val="es-MX"/>
+            <w:lang w:val="en-US"/>
           </w:rPr>
           <w:t>https://machine-learning-made-simple.medium.com/picking-between-gofai-ml-and-deep-learning-summary-217c5471358b</w:t>
         </w:r>
@@ -1497,21 +1731,14 @@
     <w:p>
       <w:pPr>
         <w:rPr>
-          <w:lang w:val="es-MX"/>
-        </w:rPr>
-      </w:pPr>
-    </w:p>
-    <w:p>
-      <w:pPr>
-        <w:rPr>
-          <w:lang w:val="es-MX"/>
-        </w:rPr>
-      </w:pPr>
-      <w:hyperlink r:id="rId9">
+          <w:lang w:val="en-US"/>
+        </w:rPr>
+      </w:pPr>
+      <w:hyperlink r:id="rId10">
         <w:r>
           <w:rPr>
             <w:rStyle w:val="Hipervnculo"/>
-            <w:lang w:val="es-MX"/>
+            <w:lang w:val="en-US"/>
           </w:rPr>
           <w:t>https://en.wikipedia.org/wiki/Symbolic_artificial_intelligence</w:t>
         </w:r>
@@ -1520,14 +1747,14 @@
     <w:p>
       <w:pPr>
         <w:rPr>
-          <w:lang w:val="es-MX"/>
-        </w:rPr>
-      </w:pPr>
-      <w:hyperlink r:id="rId10">
+          <w:lang w:val="en-US"/>
+        </w:rPr>
+      </w:pPr>
+      <w:hyperlink r:id="rId11">
         <w:r>
           <w:rPr>
             <w:rStyle w:val="Hipervnculo"/>
-            <w:lang w:val="es-MX"/>
+            <w:lang w:val="en-US"/>
           </w:rPr>
           <w:t>https://en.wikipedia.org/wiki/Knowledge_acquisition</w:t>
         </w:r>
@@ -1536,15 +1763,42 @@
     <w:p>
       <w:pPr>
         <w:rPr>
-          <w:lang w:val="es-MX"/>
-        </w:rPr>
-      </w:pPr>
-      <w:r>
-        <w:rPr>
-          <w:lang w:val="es-MX"/>
-        </w:rPr>
-        <w:t>https://en.wikipedia.org/wiki/Machine_learning</w:t>
-      </w:r>
+          <w:u w:val="single"/>
+          <w:lang w:val="en-US"/>
+        </w:rPr>
+      </w:pPr>
+      <w:hyperlink r:id="rId12" w:history="1">
+        <w:r>
+          <w:rPr>
+            <w:rStyle w:val="Hipervnculo"/>
+            <w:lang w:val="en-US"/>
+          </w:rPr>
+          <w:t>https://en.wikipedia.org/wiki/Machine_learning</w:t>
+        </w:r>
+      </w:hyperlink>
+    </w:p>
+    <w:p>
+      <w:pPr>
+        <w:rPr>
+          <w:lang w:val="en-US"/>
+        </w:rPr>
+      </w:pPr>
+      <w:hyperlink r:id="rId13" w:history="1">
+        <w:r>
+          <w:rPr>
+            <w:rStyle w:val="Hipervnculo"/>
+            <w:lang w:val="en-US"/>
+          </w:rPr>
+          <w:t>https://www.geeksforgeeks.org/deep-learning/introduction-deep-learning/</w:t>
+        </w:r>
+      </w:hyperlink>
+    </w:p>
+    <w:p>
+      <w:pPr>
+        <w:rPr>
+          <w:lang w:val="en-US"/>
+        </w:rPr>
+      </w:pPr>
     </w:p>
     <w:sectPr>
       <w:pgSz w:w="11906" w:h="16838"/>
@@ -1988,7 +2242,6 @@
     <w:next w:val="Normal"/>
     <w:link w:val="Ttulo2Car"/>
     <w:uiPriority w:val="9"/>
-    <w:semiHidden/>
     <w:unhideWhenUsed/>
     <w:qFormat/>
     <w:pPr>
@@ -2010,7 +2263,6 @@
     <w:next w:val="Normal"/>
     <w:link w:val="Ttulo3Car"/>
     <w:uiPriority w:val="9"/>
-    <w:semiHidden/>
     <w:unhideWhenUsed/>
     <w:qFormat/>
     <w:pPr>
@@ -2031,7 +2283,6 @@
     <w:next w:val="Normal"/>
     <w:link w:val="Ttulo4Car"/>
     <w:uiPriority w:val="9"/>
-    <w:semiHidden/>
     <w:unhideWhenUsed/>
     <w:qFormat/>
     <w:pPr>
@@ -2484,6 +2735,18 @@
       <w:rFonts w:ascii="Liberation Mono" w:eastAsia="Liberation Mono" w:hAnsi="Liberation Mono" w:cs="Liberation Mono"/>
       <w:sz w:val="20"/>
       <w:szCs w:val="20"/>
+    </w:rPr>
+  </w:style>
+  <w:style w:type="character" w:styleId="Mencinsinresolver">
+    <w:name w:val="Unresolved Mention"/>
+    <w:basedOn w:val="Fuentedeprrafopredeter"/>
+    <w:uiPriority w:val="99"/>
+    <w:semiHidden/>
+    <w:unhideWhenUsed/>
+    <w:rsid w:val="00704EB7"/>
+    <w:rPr>
+      <w:color w:val="605E5C"/>
+      <w:shd w:val="clear" w:color="auto" w:fill="E1DFDD"/>
     </w:rPr>
   </w:style>
 </w:styles>

</xml_diff>